<commit_message>
Add Hebrew peer-reviewed OA source (Rodriguez Barnea 2025) to Miriam's work
Co-Authored-By: Claude <noreply@anthropic.com>
</commit_message>
<xml_diff>
--- a/מוגבלות_וסיכון_רפלקציה_מרים.docx
+++ b/מוגבלות_וסיכון_רפלקציה_מרים.docx
@@ -456,6 +456,24 @@
           <w:szCs w:val="24"/>
           <w:rtl w:val="1"/>
         </w:rPr>
+        <w:t>ההקשבה הזאת דורשת שנלמד לפרש גם את מה שאנשים על הרצף אומרים בלי מילים. מחקר עדכני שעסק בהתנהגויות מאתגרות בקרב ילדים עם אוטיזם הראה שהתנהגות היא לא פעם "קול", דרך תקשורת שמאותתת על מצוקה או על כאב שאין לו ביטוי מילולי, ולכן היא מזמינה פענוח וחיפוש אחר הסיבה ולא השתקה. בבני ציון ההתנהגות של הדיירים נתפסה כבעיה שיש לדכא במקום כמסר שיש להקשיב לו, וזה בדיוק ההיפך מהגנה. לראות בהתנהגות קול הוא תנאי לזיהוי מוקדם של פגיעה ולשמירה על כבודו של האדם (רודריגז ברנע, 2025).</w:t>
+      </w:r>
+    </w:p>
+    <w:p>
+      <w:pPr>
+        <w:bidi w:val="1"/>
+        <w:spacing w:line="360" w:lineRule="auto" w:after="160"/>
+        <w:jc w:val="both"/>
+      </w:pPr>
+      <w:r>
+        <w:rPr>
+          <w:rFonts w:ascii="David" w:hAnsi="David" w:cs="David"/>
+          <w:b w:val="0"/>
+          <w:i w:val="0"/>
+          <w:sz w:val="24"/>
+          <w:szCs w:val="24"/>
+          <w:rtl w:val="1"/>
+        </w:rPr>
         <w:t>ההשלכה המעשית מתבררת בעבודה של אנשי המקצוע בשטח. מחקר ישראלי שבחן תפיסות ושיקולים של עובדות סוציאליות בתהליכי מינוי אפוטרופסות מול קבלת החלטות נתמכת מצא שלמרות תיקון 18 לחוק הכשרות המשפטית משנת 2016, שנועד לצמצם את השימוש באפוטרופסות ולקדם חלופות כמו קבלת החלטות נתמכת, נותר פער בין חזון הרפורמה לבין הפרקטיקה בשטח. הבחירה בין אפוטרופסות לתמיכה רחוקה מלהיות טכנית, והיא נשענת על תפיסות של אנשי המקצוע לגבי אבחון האדם, רמת התפקוד שלו ורצונו, ועל מטרות של מניעת סיכון וקידום איכות חיים. הכותבות ממליצות על שינוי בהכשרה ובמדיניות שיאפשר מעבר ממודל האפוטרופסות אל מודל של תמיכה, שבו האדם נשאר בעל ההחלטה ומקבל סביבו מעגל שעוזר לו להבין, לשקול ולבחור (הולר וורנר, 2025). הגישה הזאת שוברת את הקישור האוטומטי בין קושי בקבלת החלטות לבין שלילת הזכות להחליט, קישור שעמד בבסיס המודל הישן.</w:t>
       </w:r>
     </w:p>
@@ -581,6 +599,71 @@
           <w:szCs w:val="24"/>
           <w:rtl w:val="1"/>
         </w:rPr>
+        <w:t xml:space="preserve">רודריגז ברנע, ע' (2025). "התנהגות כקול": סקירת בעיות רפואיות נלוות המתבטאות בהתנהגויות מאתגרות בקרב ילדים עם אוטיזם וההתערבויות הטיפוליות. </w:t>
+      </w:r>
+      <w:r>
+        <w:rPr>
+          <w:rFonts w:ascii="David" w:hAnsi="David" w:cs="David"/>
+          <w:b w:val="0"/>
+          <w:i/>
+          <w:sz w:val="24"/>
+          <w:szCs w:val="24"/>
+          <w:rtl w:val="1"/>
+        </w:rPr>
+        <w:t>מוגבלות וחברה: מחקר ופרקטיקה, 5</w:t>
+      </w:r>
+      <w:r>
+        <w:rPr>
+          <w:rFonts w:ascii="David" w:hAnsi="David" w:cs="David"/>
+          <w:b w:val="0"/>
+          <w:i w:val="0"/>
+          <w:sz w:val="24"/>
+          <w:szCs w:val="24"/>
+          <w:rtl w:val="1"/>
+        </w:rPr>
+        <w:t>, 101-132.</w:t>
+      </w:r>
+      <w:r>
+        <w:rPr>
+          <w:rFonts w:ascii="David" w:hAnsi="David" w:cs="David"/>
+          <w:b w:val="0"/>
+          <w:i w:val="0"/>
+          <w:sz w:val="24"/>
+          <w:szCs w:val="24"/>
+          <w:rtl w:val="1"/>
+        </w:rPr>
+        <w:t xml:space="preserve"> </w:t>
+      </w:r>
+      <w:hyperlink r:id="rId10">
+        <w:r>
+          <w:rPr>
+            <w:rFonts w:ascii="David" w:hAnsi="David" w:cs="David"/>
+            <w:sz w:val="24"/>
+            <w:szCs w:val="24"/>
+            <w:color w:val="0563C1"/>
+            <w:u w:val="single"/>
+            <w:rtl w:val="1"/>
+          </w:rPr>
+          <w:t xml:space="preserve">https://kb.beitissie.org.il/digital/%D7%9E%D7%95%D7%92%D7%91%D7%9C%D7%95%D7%AA-%D7%95%D7%97%D7%91%D7%A8%D7%94_%D7%9E%D7%94%D7%93%D7%95%D7%A8%D7%94-%D7%93%D7%99%D7%92%D7%99%D7%98%D7%9C%D7%99%D7%AA_%D7%92%D7%99%D7%9C%D7%99%D7%95%D7%9F-5/</w:t>
+        </w:r>
+      </w:hyperlink>
+    </w:p>
+    <w:p>
+      <w:pPr>
+        <w:bidi w:val="1"/>
+        <w:spacing w:line="360" w:lineRule="auto" w:after="200"/>
+        <w:ind w:left="720" w:hanging="720"/>
+        <w:jc w:val="both"/>
+      </w:pPr>
+      <w:r>
+        <w:rPr>
+          <w:rFonts w:ascii="David" w:hAnsi="David" w:cs="David"/>
+          <w:b w:val="0"/>
+          <w:i w:val="0"/>
+          <w:sz w:val="24"/>
+          <w:szCs w:val="24"/>
+          <w:rtl w:val="1"/>
+        </w:rPr>
         <w:t xml:space="preserve">Hughes, K., Bellis, M. A., Jones, L., Wood, S., Bates, G., Eckley, L., … Officer, A. (2012). Prevalence and risk of violence against adults with disabilities: A systematic review and meta-analysis of observational studies. </w:t>
       </w:r>
       <w:r>
@@ -616,7 +699,7 @@
         </w:rPr>
         <w:t xml:space="preserve"> </w:t>
       </w:r>
-      <w:hyperlink r:id="rId10">
+      <w:hyperlink r:id="rId11">
         <w:r>
           <w:rPr>
             <w:rFonts w:ascii="David" w:hAnsi="David" w:cs="David"/>
@@ -681,7 +764,7 @@
         </w:rPr>
         <w:t xml:space="preserve"> </w:t>
       </w:r>
-      <w:hyperlink r:id="rId11">
+      <w:hyperlink r:id="rId12">
         <w:r>
           <w:rPr>
             <w:rFonts w:ascii="David" w:hAnsi="David" w:cs="David"/>

</xml_diff>